<commit_message>
feat: Fase 1 - Semanas 2 e 3: extracao de escopo, geracao de casos via IA e persistencia
Pivo do dominio de tarefas/projetos para o Gestor de Casos de Teste com IA:
extracao de texto de escopo (docx/pdf), interface LLMProvider + adaptador
ProvedorClaude (geracao estruturada via tool call), e o servico
processar_escopo que orquestra extracao -> IA -> persistencia de
CasoDeTeste e auditoria em GeracaoIA. Cobertura de testes automatizados
para os tres pontos.

Co-Authored-By: Claude Sonnet 5 <noreply@anthropic.com>
</commit_message>
<xml_diff>
--- a/docs/escopo-projeto.docx
+++ b/docs/escopo-projeto.docx
@@ -56,7 +56,7 @@
           <w:color w:val="2E471D"/>
           <w:sz w:val="30"/>
         </w:rPr>
-        <w:t>Sistema de Gestão de Tarefas e Projetos (To-Do Avançado)</w:t>
+        <w:t>Gestor de Casos de Teste com Geração Assistida por IA</w:t>
       </w:r>
     </w:p>
     <w:p>
@@ -70,7 +70,7 @@
           <w:color w:val="666666"/>
           <w:sz w:val="22"/>
         </w:rPr>
-        <w:t>PDI 2026-2027 — Cleiton Ferreira</w:t>
+        <w:t>PDI 2026-2027 – Cleiton Ferreira</w:t>
       </w:r>
     </w:p>
     <w:p>
@@ -84,7 +84,7 @@
           <w:color w:val="999999"/>
           <w:sz w:val="22"/>
         </w:rPr>
-        <w:t>Agosto 2026</w:t>
+        <w:t>Setembro 2026</w:t>
       </w:r>
     </w:p>
     <w:p>
@@ -98,7 +98,7 @@
           <w:color w:val="999999"/>
           <w:sz w:val="22"/>
         </w:rPr>
-        <w:t>Versão: 1.0</w:t>
+        <w:t>Versão: 2.0</w:t>
       </w:r>
     </w:p>
     <w:p>
@@ -131,7 +131,21 @@
           <w:color w:val="000000"/>
           <w:sz w:val="22"/>
         </w:rPr>
-        <w:t>Este projeto é desenvolvido como parte do Plano de Desenvolvimento Individual (PDI) do usuário, com o objetivo de evoluir habilidades em Python, desenvolvimento de APIs e containerização com Docker. A apresentação final está prevista para outubro de 2026, com a API funcionando e a documentação de uso completa.</w:t>
+        <w:t>Este projeto é desenvolvido como parte do Plano de Desenvolvimento Individual (PDI) do usuário, com o objetivo de evoluir habilidades em Python, desenvolvimento de APIs, integração com Inteligência Artificial e containerização com Docker. A apresentação final está prevista para outubro de 2026, com a API funcionando e a documentação de uso completa.</w:t>
+      </w:r>
+    </w:p>
+    <w:p>
+      <w:pPr>
+        <w:spacing w:after="120"/>
+      </w:pPr>
+      <w:r>
+        <w:rPr>
+          <w:rFonts w:ascii="Kodchasan" w:hAnsi="Kodchasan"/>
+          <w:b w:val="0"/>
+          <w:color w:val="000000"/>
+          <w:sz w:val="22"/>
+        </w:rPr>
+        <w:t>O projeto foi replanejado a partir de uma ferramenta interna de gestão de casos de teste já desenvolvida pelo autor para o processo PM06 (Desvio de Estoque e Alçada de Aprovação — Fluig), generalizando seu escopo para qualquer processo de negócio e evoluindo-a de uma aplicação local sem persistência para um sistema com API REST, banco de dados, containerização com Docker e geração automática de casos de teste assistida por Inteligência Artificial.</w:t>
       </w:r>
     </w:p>
     <w:p>
@@ -159,7 +173,7 @@
           <w:color w:val="000000"/>
           <w:sz w:val="22"/>
         </w:rPr>
-        <w:t>Construir um sistema de gestão de tarefas e projetos (To-Do avançado) em Python, evoluindo em fases incrementais, culminando em uma API REST containerizada com Docker e documentação completa de utilização.</w:t>
+        <w:t>Construir um sistema de gestão de casos de teste em Python, capaz de gerar automaticamente casos de teste a partir de um documento de escopo enviado pelo usuário — por meio de Inteligência Artificial —, evoluindo em fases incrementais até uma API REST containerizada com Docker e documentação completa de utilização.</w:t>
       </w:r>
     </w:p>
     <w:p>
@@ -202,37 +216,52 @@
           <w:color w:val="000000"/>
           <w:sz w:val="22"/>
         </w:rPr>
-        <w:t>•  Modelagem das entidades principais: tarefas, projetos, status, prioridades, prazos.</w:t>
-      </w:r>
-    </w:p>
-    <w:p>
-      <w:pPr>
-        <w:spacing w:after="60"/>
-        <w:ind w:left="283"/>
-      </w:pPr>
-      <w:r>
-        <w:rPr>
-          <w:rFonts w:ascii="Kodchasan" w:hAnsi="Kodchasan"/>
-          <w:b w:val="0"/>
-          <w:color w:val="000000"/>
-          <w:sz w:val="22"/>
-        </w:rPr>
-        <w:t>•  Lógica de negócio pura em Python (sem API ainda): criar, listar, atualizar, concluir e excluir tarefas; organizar tarefas em projetos.</w:t>
-      </w:r>
-    </w:p>
-    <w:p>
-      <w:pPr>
-        <w:spacing w:after="60"/>
-        <w:ind w:left="283"/>
-      </w:pPr>
-      <w:r>
-        <w:rPr>
-          <w:rFonts w:ascii="Kodchasan" w:hAnsi="Kodchasan"/>
-          <w:b w:val="0"/>
-          <w:color w:val="000000"/>
-          <w:sz w:val="22"/>
-        </w:rPr>
-        <w:t>•  Persistência inicial simples (ex.: arquivo ou banco local) para viabilizar testes.</w:t>
+        <w:t>•  Modelagem das entidades principais: projeto de teste, escopo, caso de teste, rodada de execução, execução de caso e defeito.</w:t>
+      </w:r>
+    </w:p>
+    <w:p>
+      <w:pPr>
+        <w:spacing w:after="60"/>
+        <w:ind w:left="283"/>
+      </w:pPr>
+      <w:r>
+        <w:rPr>
+          <w:rFonts w:ascii="Kodchasan" w:hAnsi="Kodchasan"/>
+          <w:b w:val="0"/>
+          <w:color w:val="000000"/>
+          <w:sz w:val="22"/>
+        </w:rPr>
+        <w:t>•  Extração de texto de documentos de escopo enviados pelo usuário (Word ou PDF).</w:t>
+      </w:r>
+    </w:p>
+    <w:p>
+      <w:pPr>
+        <w:spacing w:after="60"/>
+        <w:ind w:left="283"/>
+      </w:pPr>
+      <w:r>
+        <w:rPr>
+          <w:rFonts w:ascii="Kodchasan" w:hAnsi="Kodchasan"/>
+          <w:b w:val="0"/>
+          <w:color w:val="000000"/>
+          <w:sz w:val="22"/>
+        </w:rPr>
+        <w:t>•  Lógica de negócio pura em Python (sem API ainda): criar, listar, atualizar e excluir casos de teste; organizar casos em rodadas de execução; registrar defeitos.</w:t>
+      </w:r>
+    </w:p>
+    <w:p>
+      <w:pPr>
+        <w:spacing w:after="60"/>
+        <w:ind w:left="283"/>
+      </w:pPr>
+      <w:r>
+        <w:rPr>
+          <w:rFonts w:ascii="Kodchasan" w:hAnsi="Kodchasan"/>
+          <w:b w:val="0"/>
+          <w:color w:val="000000"/>
+          <w:sz w:val="22"/>
+        </w:rPr>
+        <w:t>•  Persistência com SQLAlchemy e SQLite, evoluindo para o banco definido na Fase 3.</w:t>
       </w:r>
     </w:p>
     <w:p>
@@ -261,7 +290,7 @@
           <w:color w:val="2E471D"/>
           <w:sz w:val="22"/>
         </w:rPr>
-        <w:t>Fase 2 — API (Python)</w:t>
+        <w:t>Fase 2 — API e Integração com IA (Python)</w:t>
       </w:r>
     </w:p>
     <w:p>
@@ -291,7 +320,22 @@
           <w:color w:val="000000"/>
           <w:sz w:val="22"/>
         </w:rPr>
-        <w:t>•  Endpoints para as operações de tarefas e projetos definidas na Fase 1.</w:t>
+        <w:t>•  Endpoint de upload de documento de escopo e geração automática de casos de teste via Inteligência Artificial, um escopo por vez.</w:t>
+      </w:r>
+    </w:p>
+    <w:p>
+      <w:pPr>
+        <w:spacing w:after="60"/>
+        <w:ind w:left="283"/>
+      </w:pPr>
+      <w:r>
+        <w:rPr>
+          <w:rFonts w:ascii="Kodchasan" w:hAnsi="Kodchasan"/>
+          <w:b w:val="0"/>
+          <w:color w:val="000000"/>
+          <w:sz w:val="22"/>
+        </w:rPr>
+        <w:t>•  Endpoints para as demais operações definidas na Fase 1 (casos de teste, rodadas, execuções, defeitos).</w:t>
       </w:r>
     </w:p>
     <w:p>
@@ -395,7 +439,7 @@
           <w:color w:val="000000"/>
           <w:sz w:val="22"/>
         </w:rPr>
-        <w:t>•  Preparação da apresentação de outubro/2026: demonstração da API funcionando e da documentação.</w:t>
+        <w:t>•  Preparação da apresentação de outubro/2026: demonstração da API funcionando, da geração de casos de teste via IA e da documentação.</w:t>
       </w:r>
     </w:p>
     <w:p>
@@ -409,67 +453,81 @@
           <w:color w:val="2E471D"/>
           <w:sz w:val="24"/>
         </w:rPr>
-        <w:t>4. Fora de Escopo (nesta primeira versão)</w:t>
-      </w:r>
-    </w:p>
-    <w:p>
-      <w:pPr>
-        <w:spacing w:after="60"/>
-        <w:ind w:left="283"/>
-      </w:pPr>
-      <w:r>
-        <w:rPr>
-          <w:rFonts w:ascii="Kodchasan" w:hAnsi="Kodchasan"/>
-          <w:b w:val="0"/>
-          <w:color w:val="000000"/>
-          <w:sz w:val="22"/>
-        </w:rPr>
-        <w:t>•  Autenticação/autorização de múltiplos usuários.</w:t>
-      </w:r>
-    </w:p>
-    <w:p>
-      <w:pPr>
-        <w:spacing w:after="60"/>
-        <w:ind w:left="283"/>
-      </w:pPr>
-      <w:r>
-        <w:rPr>
-          <w:rFonts w:ascii="Kodchasan" w:hAnsi="Kodchasan"/>
-          <w:b w:val="0"/>
-          <w:color w:val="000000"/>
-          <w:sz w:val="22"/>
-        </w:rPr>
-        <w:t>•  Interface gráfica (frontend).</w:t>
-      </w:r>
-    </w:p>
-    <w:p>
-      <w:pPr>
-        <w:spacing w:after="60"/>
-        <w:ind w:left="283"/>
-      </w:pPr>
-      <w:r>
-        <w:rPr>
-          <w:rFonts w:ascii="Kodchasan" w:hAnsi="Kodchasan"/>
-          <w:b w:val="0"/>
-          <w:color w:val="000000"/>
-          <w:sz w:val="22"/>
-        </w:rPr>
-        <w:t>•  Deploy em ambiente de produção ou nuvem.</w:t>
-      </w:r>
-    </w:p>
-    <w:p>
-      <w:pPr>
-        <w:spacing w:after="60"/>
-        <w:ind w:left="283"/>
-      </w:pPr>
-      <w:r>
-        <w:rPr>
-          <w:rFonts w:ascii="Kodchasan" w:hAnsi="Kodchasan"/>
-          <w:b w:val="0"/>
-          <w:color w:val="000000"/>
-          <w:sz w:val="22"/>
-        </w:rPr>
-        <w:t>•  Filas, mensageria ou processamento assíncrono.</w:t>
+        <w:t>4. Integração com Inteligência Artificial</w:t>
+      </w:r>
+    </w:p>
+    <w:p>
+      <w:pPr>
+        <w:spacing w:after="120"/>
+      </w:pPr>
+      <w:r>
+        <w:rPr>
+          <w:rFonts w:ascii="Kodchasan" w:hAnsi="Kodchasan"/>
+          <w:b w:val="0"/>
+          <w:color w:val="000000"/>
+          <w:sz w:val="22"/>
+        </w:rPr>
+        <w:t>A geração automática de casos de teste é feita por um provedor de linguagem (LLM) acionado a partir do texto extraído do documento de escopo. A camada de integração com IA é desenhada como uma interface independente de provedor: o sistema core não depende de um provedor específico, apenas de um contrato comum. A primeira implementação entregue usa a API oficial da Anthropic (Claude), mas a arquitetura permite adicionar outros provedores no futuro sem alterar o restante do sistema.</w:t>
+      </w:r>
+    </w:p>
+    <w:p>
+      <w:pPr>
+        <w:spacing w:after="60"/>
+        <w:ind w:left="283"/>
+      </w:pPr>
+      <w:r>
+        <w:rPr>
+          <w:rFonts w:ascii="Kodchasan" w:hAnsi="Kodchasan"/>
+          <w:b w:val="0"/>
+          <w:color w:val="000000"/>
+          <w:sz w:val="22"/>
+        </w:rPr>
+        <w:t>•  Upload de um documento de escopo por vez (Word ou PDF).</w:t>
+      </w:r>
+    </w:p>
+    <w:p>
+      <w:pPr>
+        <w:spacing w:after="60"/>
+        <w:ind w:left="283"/>
+      </w:pPr>
+      <w:r>
+        <w:rPr>
+          <w:rFonts w:ascii="Kodchasan" w:hAnsi="Kodchasan"/>
+          <w:b w:val="0"/>
+          <w:color w:val="000000"/>
+          <w:sz w:val="22"/>
+        </w:rPr>
+        <w:t>•  Extração do texto do documento e envio estruturado ao provedor de IA.</w:t>
+      </w:r>
+    </w:p>
+    <w:p>
+      <w:pPr>
+        <w:spacing w:after="60"/>
+        <w:ind w:left="283"/>
+      </w:pPr>
+      <w:r>
+        <w:rPr>
+          <w:rFonts w:ascii="Kodchasan" w:hAnsi="Kodchasan"/>
+          <w:b w:val="0"/>
+          <w:color w:val="000000"/>
+          <w:sz w:val="22"/>
+        </w:rPr>
+        <w:t>•  Retorno dos casos de teste já no formato de dados usado pelo sistema, sem necessidade de interpretar texto livre.</w:t>
+      </w:r>
+    </w:p>
+    <w:p>
+      <w:pPr>
+        <w:spacing w:after="60"/>
+        <w:ind w:left="283"/>
+      </w:pPr>
+      <w:r>
+        <w:rPr>
+          <w:rFonts w:ascii="Kodchasan" w:hAnsi="Kodchasan"/>
+          <w:b w:val="0"/>
+          <w:color w:val="000000"/>
+          <w:sz w:val="22"/>
+        </w:rPr>
+        <w:t>•  Casos gerados ficam sujeitos à revisão do usuário antes de serem usados nas rodadas de execução.</w:t>
       </w:r>
     </w:p>
     <w:p>
@@ -483,67 +541,97 @@
           <w:color w:val="2E471D"/>
           <w:sz w:val="24"/>
         </w:rPr>
-        <w:t>5. Entregáveis</w:t>
-      </w:r>
-    </w:p>
-    <w:p>
-      <w:pPr>
-        <w:spacing w:after="60"/>
-        <w:ind w:left="283"/>
-      </w:pPr>
-      <w:r>
-        <w:rPr>
-          <w:rFonts w:ascii="Kodchasan" w:hAnsi="Kodchasan"/>
-          <w:b w:val="0"/>
-          <w:color w:val="000000"/>
-          <w:sz w:val="22"/>
-        </w:rPr>
-        <w:t>•  Código-fonte do sistema core, da API e dos arquivos Docker.</w:t>
-      </w:r>
-    </w:p>
-    <w:p>
-      <w:pPr>
-        <w:spacing w:after="60"/>
-        <w:ind w:left="283"/>
-      </w:pPr>
-      <w:r>
-        <w:rPr>
-          <w:rFonts w:ascii="Kodchasan" w:hAnsi="Kodchasan"/>
-          <w:b w:val="0"/>
-          <w:color w:val="000000"/>
-          <w:sz w:val="22"/>
-        </w:rPr>
-        <w:t>•  Testes automatizados.</w:t>
-      </w:r>
-    </w:p>
-    <w:p>
-      <w:pPr>
-        <w:spacing w:after="60"/>
-        <w:ind w:left="283"/>
-      </w:pPr>
-      <w:r>
-        <w:rPr>
-          <w:rFonts w:ascii="Kodchasan" w:hAnsi="Kodchasan"/>
-          <w:b w:val="0"/>
-          <w:color w:val="000000"/>
-          <w:sz w:val="22"/>
-        </w:rPr>
-        <w:t>•  Documentação de uso da API.</w:t>
-      </w:r>
-    </w:p>
-    <w:p>
-      <w:pPr>
-        <w:spacing w:after="60"/>
-        <w:ind w:left="283"/>
-      </w:pPr>
-      <w:r>
-        <w:rPr>
-          <w:rFonts w:ascii="Kodchasan" w:hAnsi="Kodchasan"/>
-          <w:b w:val="0"/>
-          <w:color w:val="000000"/>
-          <w:sz w:val="22"/>
-        </w:rPr>
-        <w:t>•  Apresentação final (outubro/2026).</w:t>
+        <w:t>5. Fora de Escopo (nesta primeira versão)</w:t>
+      </w:r>
+    </w:p>
+    <w:p>
+      <w:pPr>
+        <w:spacing w:after="60"/>
+        <w:ind w:left="283"/>
+      </w:pPr>
+      <w:r>
+        <w:rPr>
+          <w:rFonts w:ascii="Kodchasan" w:hAnsi="Kodchasan"/>
+          <w:b w:val="0"/>
+          <w:color w:val="000000"/>
+          <w:sz w:val="22"/>
+        </w:rPr>
+        <w:t>•  Autenticação/autorização de múltiplos usuários.</w:t>
+      </w:r>
+    </w:p>
+    <w:p>
+      <w:pPr>
+        <w:spacing w:after="60"/>
+        <w:ind w:left="283"/>
+      </w:pPr>
+      <w:r>
+        <w:rPr>
+          <w:rFonts w:ascii="Kodchasan" w:hAnsi="Kodchasan"/>
+          <w:b w:val="0"/>
+          <w:color w:val="000000"/>
+          <w:sz w:val="22"/>
+        </w:rPr>
+        <w:t>•  Interface gráfica dedicada (frontend) — o foco desta versão é a API.</w:t>
+      </w:r>
+    </w:p>
+    <w:p>
+      <w:pPr>
+        <w:spacing w:after="60"/>
+        <w:ind w:left="283"/>
+      </w:pPr>
+      <w:r>
+        <w:rPr>
+          <w:rFonts w:ascii="Kodchasan" w:hAnsi="Kodchasan"/>
+          <w:b w:val="0"/>
+          <w:color w:val="000000"/>
+          <w:sz w:val="22"/>
+        </w:rPr>
+        <w:t>•  Suporte simultâneo a múltiplos provedores de IA no primeiro lançamento — a arquitetura permite, mas apenas um provedor será implementado até outubro/2026.</w:t>
+      </w:r>
+    </w:p>
+    <w:p>
+      <w:pPr>
+        <w:spacing w:after="60"/>
+        <w:ind w:left="283"/>
+      </w:pPr>
+      <w:r>
+        <w:rPr>
+          <w:rFonts w:ascii="Kodchasan" w:hAnsi="Kodchasan"/>
+          <w:b w:val="0"/>
+          <w:color w:val="000000"/>
+          <w:sz w:val="22"/>
+        </w:rPr>
+        <w:t>•  Armazenamento do conteúdo de evidências (imagens, PDFs) — apenas metadados.</w:t>
+      </w:r>
+    </w:p>
+    <w:p>
+      <w:pPr>
+        <w:spacing w:after="60"/>
+        <w:ind w:left="283"/>
+      </w:pPr>
+      <w:r>
+        <w:rPr>
+          <w:rFonts w:ascii="Kodchasan" w:hAnsi="Kodchasan"/>
+          <w:b w:val="0"/>
+          <w:color w:val="000000"/>
+          <w:sz w:val="22"/>
+        </w:rPr>
+        <w:t>•  Deploy em ambiente de produção ou nuvem.</w:t>
+      </w:r>
+    </w:p>
+    <w:p>
+      <w:pPr>
+        <w:spacing w:after="60"/>
+        <w:ind w:left="283"/>
+      </w:pPr>
+      <w:r>
+        <w:rPr>
+          <w:rFonts w:ascii="Kodchasan" w:hAnsi="Kodchasan"/>
+          <w:b w:val="0"/>
+          <w:color w:val="000000"/>
+          <w:sz w:val="22"/>
+        </w:rPr>
+        <w:t>•  Filas, mensageria ou processamento assíncrono.</w:t>
       </w:r>
     </w:p>
     <w:p>
@@ -557,7 +645,81 @@
           <w:color w:val="2E471D"/>
           <w:sz w:val="24"/>
         </w:rPr>
-        <w:t>6. Cronograma Macro</w:t>
+        <w:t>6. Entregáveis</w:t>
+      </w:r>
+    </w:p>
+    <w:p>
+      <w:pPr>
+        <w:spacing w:after="60"/>
+        <w:ind w:left="283"/>
+      </w:pPr>
+      <w:r>
+        <w:rPr>
+          <w:rFonts w:ascii="Kodchasan" w:hAnsi="Kodchasan"/>
+          <w:b w:val="0"/>
+          <w:color w:val="000000"/>
+          <w:sz w:val="22"/>
+        </w:rPr>
+        <w:t>•  Código-fonte do sistema core, da API, da integração com IA e dos arquivos Docker.</w:t>
+      </w:r>
+    </w:p>
+    <w:p>
+      <w:pPr>
+        <w:spacing w:after="60"/>
+        <w:ind w:left="283"/>
+      </w:pPr>
+      <w:r>
+        <w:rPr>
+          <w:rFonts w:ascii="Kodchasan" w:hAnsi="Kodchasan"/>
+          <w:b w:val="0"/>
+          <w:color w:val="000000"/>
+          <w:sz w:val="22"/>
+        </w:rPr>
+        <w:t>•  Testes automatizados.</w:t>
+      </w:r>
+    </w:p>
+    <w:p>
+      <w:pPr>
+        <w:spacing w:after="60"/>
+        <w:ind w:left="283"/>
+      </w:pPr>
+      <w:r>
+        <w:rPr>
+          <w:rFonts w:ascii="Kodchasan" w:hAnsi="Kodchasan"/>
+          <w:b w:val="0"/>
+          <w:color w:val="000000"/>
+          <w:sz w:val="22"/>
+        </w:rPr>
+        <w:t>•  Documentação de uso da API.</w:t>
+      </w:r>
+    </w:p>
+    <w:p>
+      <w:pPr>
+        <w:spacing w:after="60"/>
+        <w:ind w:left="283"/>
+      </w:pPr>
+      <w:r>
+        <w:rPr>
+          <w:rFonts w:ascii="Kodchasan" w:hAnsi="Kodchasan"/>
+          <w:b w:val="0"/>
+          <w:color w:val="000000"/>
+          <w:sz w:val="22"/>
+        </w:rPr>
+        <w:t>•  Apresentação final (outubro/2026).</w:t>
+      </w:r>
+    </w:p>
+    <w:p>
+      <w:pPr>
+        <w:spacing w:before="240" w:after="120"/>
+      </w:pPr>
+      <w:r>
+        <w:rPr>
+          <w:rFonts w:ascii="Kodchasan" w:hAnsi="Kodchasan"/>
+          <w:b/>
+          <w:color w:val="2E471D"/>
+          <w:sz w:val="24"/>
+        </w:rPr>
+        <w:t>7. Cronograma Macro</w:t>
       </w:r>
     </w:p>
     <w:tbl>
@@ -690,7 +852,7 @@
                 <w:color w:val="000000"/>
                 <w:sz w:val="22"/>
               </w:rPr>
-              <w:t>Sistema core em Python</w:t>
+              <w:t>Sistema core e extração de documentos de escopo</w:t>
             </w:r>
           </w:p>
         </w:tc>
@@ -764,7 +926,7 @@
                 <w:color w:val="000000"/>
                 <w:sz w:val="22"/>
               </w:rPr>
-              <w:t>Construção da API sobre o sistema core</w:t>
+              <w:t>API e geração de casos de teste via IA</w:t>
             </w:r>
           </w:p>
         </w:tc>
@@ -788,7 +950,7 @@
                 <w:color w:val="000000"/>
                 <w:sz w:val="22"/>
               </w:rPr>
-              <w:t>API REST documentada (Swagger/OpenAPI)</w:t>
+              <w:t>API REST documentada (Swagger/OpenAPI), com geração automática de casos de teste</w:t>
             </w:r>
           </w:p>
         </w:tc>
@@ -838,7 +1000,7 @@
                 <w:color w:val="000000"/>
                 <w:sz w:val="22"/>
               </w:rPr>
-              <w:t>Docker + documentação final</w:t>
+              <w:t>Docker e documentação final</w:t>
             </w:r>
           </w:p>
         </w:tc>

</xml_diff>

<commit_message>
refactor: adota stack padrao ComBio (Django + Django Ninja + MySQL)
A pedido do Tech Lead que avaliara o PDI, a API passa de FastAPI para
Django Ninja, padrao de API da empresa. Para manter um unico framework
(HTTP, configuracao e persistencia), o core migra de SQLAlchemy para o
ORM do Django agora, enquanto o custo ainda e baixo (7 models e um
servico). Pelo mesmo criterio, o banco da Fase 3 passa de PostgreSQL
para MySQL.

- projeto Django em api/config (manage.py em api/); MySQL via
  MYSQL_HOST, SQLite apenas em dev/testes locais
- sistema-core/modelos vira app Django com migration inicial e admin;
  enums continuam Python puro para ia/ e documentos/ seguirem sem Django
- processar_escopo usa o ORM com gravacao atomica
- testes com pytest-django, incluindo checagem de migrations pendentes
- docs v2.1 com registro de decisoes (D1-D3): motivos, alternativas e custos

Co-Authored-By: Claude Opus 5.5 (1M context) <noreply@anthropic.com>
</commit_message>
<xml_diff>
--- a/docs/escopo-projeto.docx
+++ b/docs/escopo-projeto.docx
@@ -98,7 +98,7 @@
           <w:color w:val="999999"/>
           <w:sz w:val="22"/>
         </w:rPr>
-        <w:t>Versão: 2.0</w:t>
+        <w:t>Versão: 2.1</w:t>
       </w:r>
     </w:p>
     <w:p>
@@ -261,7 +261,7 @@
           <w:color w:val="000000"/>
           <w:sz w:val="22"/>
         </w:rPr>
-        <w:t>•  Persistência com SQLAlchemy e SQLite, evoluindo para o banco definido na Fase 3.</w:t>
+        <w:t>•  Persistência com o ORM do Django (models e migrations), usando MySQL na Fase 3, conforme o padrão de banco da ComBio, e SQLite apenas no desenvolvimento local e nos testes. Escolhido por integrar nativamente com o Django Ninja e versionar a evolução do banco por migrations.</w:t>
       </w:r>
     </w:p>
     <w:p>
@@ -305,7 +305,7 @@
           <w:color w:val="000000"/>
           <w:sz w:val="22"/>
         </w:rPr>
-        <w:t>•  Exposição do sistema core via API REST usando FastAPI, escolhido por gerar documentação interativa OpenAPI/Swagger automaticamente.</w:t>
+        <w:t>•  Exposição do sistema core via API REST usando Django + Django Ninja, adotado a pedido do Tech Lead avaliador por ser o padrão de API da ComBio, e que gera documentação interativa OpenAPI/Swagger automaticamente, com validação via Pydantic. Motivos e alternativas avaliadas no registro de decisões de docs/arquitetura-e-cronograma.md.</w:t>
       </w:r>
     </w:p>
     <w:p>
@@ -409,7 +409,7 @@
           <w:color w:val="000000"/>
           <w:sz w:val="22"/>
         </w:rPr>
-        <w:t>•  Orquestração local com docker-compose (API + banco de dados).</w:t>
+        <w:t>•  Orquestração local com docker-compose (API + banco de dados MySQL).</w:t>
       </w:r>
     </w:p>
     <w:p>

</xml_diff>